<commit_message>
chore(docker): passage a PostgreSQL 18 (image, volume pgdata18, clients pg 18, CI) et procedure de bascule documentee
</commit_message>
<xml_diff>
--- a/docs/Guide-administration-CultuResa.docx
+++ b/docs/Guide-administration-CultuResa.docx
@@ -331,13 +331,13 @@
           </w:tcPr>
           <w:p>
             <w:r>
-              <w:t xml:space="preserve">Base de données PostgreSQL 17 (volume persistant </w:t>
+              <w:t xml:space="preserve">Base de données PostgreSQL 18 (volume persistant </w:t>
             </w:r>
             <w:r>
               <w:rPr>
                 <w:rFonts w:ascii="Consolas" w:cs="Consolas" w:eastAsia="Consolas" w:hAnsi="Consolas"/>
               </w:rPr>
-              <w:t xml:space="preserve">pgdata</w:t>
+              <w:t xml:space="preserve">pgdata18</w:t>
             </w:r>
             <w:r>
               <w:t xml:space="preserve">)</w:t>
@@ -1621,7 +1621,7 @@
         <w:t xml:space="preserve">Moteur</w:t>
       </w:r>
       <w:r>
-        <w:t xml:space="preserve"> : PostgreSQL 17, dans le conteneur </w:t>
+        <w:t xml:space="preserve"> : PostgreSQL 18, dans le conteneur </w:t>
       </w:r>
       <w:r>
         <w:rPr>

</xml_diff>

<commit_message>
chore(docker): passage a PostgreSQL 18 (image, volume pgdata18, clients pg 18, CI) et procedure de bascule documentee (#31)
</commit_message>
<xml_diff>
--- a/docs/Guide-administration-CultuResa.docx
+++ b/docs/Guide-administration-CultuResa.docx
@@ -331,13 +331,13 @@
           </w:tcPr>
           <w:p>
             <w:r>
-              <w:t xml:space="preserve">Base de données PostgreSQL 17 (volume persistant </w:t>
+              <w:t xml:space="preserve">Base de données PostgreSQL 18 (volume persistant </w:t>
             </w:r>
             <w:r>
               <w:rPr>
                 <w:rFonts w:ascii="Consolas" w:cs="Consolas" w:eastAsia="Consolas" w:hAnsi="Consolas"/>
               </w:rPr>
-              <w:t xml:space="preserve">pgdata</w:t>
+              <w:t xml:space="preserve">pgdata18</w:t>
             </w:r>
             <w:r>
               <w:t xml:space="preserve">)</w:t>
@@ -1621,7 +1621,7 @@
         <w:t xml:space="preserve">Moteur</w:t>
       </w:r>
       <w:r>
-        <w:t xml:space="preserve"> : PostgreSQL 17, dans le conteneur </w:t>
+        <w:t xml:space="preserve"> : PostgreSQL 18, dans le conteneur </w:t>
       </w:r>
       <w:r>
         <w:rPr>

</xml_diff>

<commit_message>
docs(administration): Word regenere apres le passage de la commande de dump manuel a --user 10001:10001
</commit_message>
<xml_diff>
--- a/docs/Guide-administration-CultuResa.docx
+++ b/docs/Guide-administration-CultuResa.docx
@@ -2131,7 +2131,7 @@
           <w:sz w:val="18"/>
           <w:szCs w:val="18"/>
         </w:rPr>
-        <w:t xml:space="preserve">docker compose exec --user 1001:1001 cron backup.sh</w:t>
+        <w:t xml:space="preserve">docker compose exec --user 10001:10001 cron backup.sh</w:t>
       </w:r>
     </w:p>
     <w:p>
@@ -2159,7 +2159,7 @@
         <w:rPr>
           <w:rFonts w:ascii="Consolas" w:cs="Consolas" w:eastAsia="Consolas" w:hAnsi="Consolas"/>
         </w:rPr>
-        <w:t xml:space="preserve">--user 1001:1001</w:t>
+        <w:t xml:space="preserve">--user 10001:10001</w:t>
       </w:r>
       <w:r>
         <w:t xml:space="preserve"> obligatoire — le conteneur durci n'autorise plus root à écrire dans </w:t>

</xml_diff>